<commit_message>
Use masculine verb forms in practical work #1
Co-Authored-By: Claude Opus 5.5 <noreply@anthropic.com>
Claude-Session: https://claude.ai/code/session_011dYD84B4oEmkuGGVGNerEV
</commit_message>
<xml_diff>
--- a/practical-1/Практична_робота_1.docx
+++ b/practical-1/Практична_робота_1.docx
@@ -138,7 +138,7 @@
           <w:sz w:val="28"/>
           <w:szCs w:val="28"/>
         </w:rPr>
-        <w:t xml:space="preserve">Для порівняння я обрав(ла) Швейцарію та Норвегію.</w:t>
+        <w:t xml:space="preserve">Для порівняння я обрав Швейцарію та Норвегію.</w:t>
       </w:r>
     </w:p>
     <w:p>
@@ -270,7 +270,7 @@
           <w:sz w:val="28"/>
           <w:szCs w:val="28"/>
         </w:rPr>
-        <w:t xml:space="preserve">Я також порахував(ла) виробництво електроенергії на одну людину. У Норвегії: 149,5 млрд кВт·год : 5,3 млн осіб = приблизно 28 200 кВт·год на людину. У Швейцарії: 64 млрд кВт·год : 8,4 млн осіб = приблизно 7600 кВт·год на людину. Тобто Норвегія забезпечена електроенергією майже в 4 рази краще.</w:t>
+        <w:t xml:space="preserve">Я також порахував виробництво електроенергії на одну людину. У Норвегії: 149,5 млрд кВт·год : 5,3 млн осіб = приблизно 28 200 кВт·год на людину. У Швейцарії: 64 млрд кВт·год : 8,4 млн осіб = приблизно 7600 кВт·год на людину. Тобто Норвегія забезпечена електроенергією майже в 4 рази краще.</w:t>
       </w:r>
     </w:p>
     <w:p>
@@ -427,7 +427,7 @@
           <w:sz w:val="28"/>
           <w:szCs w:val="28"/>
         </w:rPr>
-        <w:t xml:space="preserve">Я порахував(ла), скільки дає кожен сектор у грошах (ВВП × частка : 100):</w:t>
+        <w:t xml:space="preserve">Я порахував, скільки дає кожен сектор у грошах (ВВП × частка : 100):</w:t>
       </w:r>
     </w:p>
     <w:tbl>
@@ -3365,7 +3365,7 @@
           <w:sz w:val="28"/>
           <w:szCs w:val="28"/>
         </w:rPr>
-        <w:t xml:space="preserve">На цій практичній роботі я порівняв(ла) промисловість Швейцарії та Норвегії. Обидві країни високорозвинені, і в обох у ВВП переважає сфера послуг. Але в Норвегії промисловість займає більшу частку (27,2%), ніж у Швейцарії (20,3%), бо там видобувають нафту і газ.</w:t>
+        <w:t xml:space="preserve">На цій практичній роботі я порівняв промисловість Швейцарії та Норвегії. Обидві країни високорозвинені, і в обох у ВВП переважає сфера послуг. Але в Норвегії промисловість займає більшу частку (27,2%), ніж у Швейцарії (20,3%), бо там видобувають нафту і газ.</w:t>
       </w:r>
     </w:p>
     <w:p>

</xml_diff>

<commit_message>
Use plain unit symbols in practical work #1
Co-Authored-By: Claude Opus 5.5 <noreply@anthropic.com>
Claude-Session: https://claude.ai/code/session_011dYD84B4oEmkuGGVGNerEV
</commit_message>
<xml_diff>
--- a/practical-1/Практична_робота_1.docx
+++ b/practical-1/Практична_робота_1.docx
@@ -240,7 +240,7 @@
           <w:sz w:val="28"/>
           <w:szCs w:val="28"/>
         </w:rPr>
-        <w:t xml:space="preserve">Забезпеченість мінеральними ресурсами. Норвегія має багато нафти і газу на шельфі Північного та Норвезького морів. Запаси нафти приблизно 8 млрд барелів, а видобувають за рік приблизно 0,73 млрд барелів. Значить, нафти вистачить приблизно на 8 : 0,73 = 11 років (якщо не знайдуть нових родовищ). Газу приблизно 1400 млрд м³, а видобуток 120 млрд м³ на рік, тобто вистачить на 1400 : 120 = 12 років. Також у Норвегії є залізні руди (Кіркенес, Му-і-Рана), титанові руди, мідь, а на Шпіцбергені - вугілля.</w:t>
+        <w:t xml:space="preserve">Забезпеченість мінеральними ресурсами. Норвегія має багато нафти і газу на шельфі Північного та Норвезького морів. Запаси нафти приблизно 8 млрд барелів, а видобувають за рік приблизно 0,73 млрд барелів. Значить, нафти вистачить приблизно на 8 : 0,73 = 11 років (якщо не знайдуть нових родовищ). Газу приблизно 1400 млрд куб. м, а видобуток 120 млрд куб. м на рік, тобто вистачить на 1400 : 120 = 12 років. Також у Норвегії є залізні руди (Кіркенес, Му-і-Рана), титанові руди, мідь, а на Шпіцбергені - вугілля.</w:t>
       </w:r>
     </w:p>
     <w:p>
@@ -270,7 +270,7 @@
           <w:sz w:val="28"/>
           <w:szCs w:val="28"/>
         </w:rPr>
-        <w:t xml:space="preserve">Я також порахував виробництво електроенергії на одну людину. У Норвегії: 149,5 млрд кВт·год : 5,3 млн осіб = приблизно 28 200 кВт·год на людину. У Швейцарії: 64 млрд кВт·год : 8,4 млн осіб = приблизно 7600 кВт·год на людину. Тобто Норвегія забезпечена електроенергією майже в 4 рази краще.</w:t>
+        <w:t xml:space="preserve">Я також порахував виробництво електроенергії на одну людину. У Норвегії: 149,5 млрд кВт*год : 5,3 млн осіб = приблизно 28 200 кВт*год на людину. У Швейцарії: 64 млрд кВт*год : 8,4 млн осіб = приблизно 7600 кВт*год на людину. Тобто Норвегія забезпечена електроенергією майже в 4 рази краще.</w:t>
       </w:r>
     </w:p>
     <w:p>
@@ -427,7 +427,7 @@
           <w:sz w:val="28"/>
           <w:szCs w:val="28"/>
         </w:rPr>
-        <w:t xml:space="preserve">Я порахував, скільки дає кожен сектор у грошах (ВВП × частка : 100):</w:t>
+        <w:t xml:space="preserve">Я порахував, скільки дає кожен сектор у грошах (ВВП * частка : 100):</w:t>
       </w:r>
     </w:p>
     <w:tbl>
@@ -1716,7 +1716,7 @@
                 <w:sz w:val="24"/>
                 <w:szCs w:val="24"/>
               </w:rPr>
-              <w:t xml:space="preserve">Свого палива немає. Електроенергії виробляють понад 64 млрд кВт·год: 60% на ГЕС, 34% на АЕС, 6% на ТЕС і ВЕС.</w:t>
+              <w:t xml:space="preserve">Свого палива немає. Електроенергії виробляють понад 64 млрд кВт*год: 60% на ГЕС, 34% на АЕС, 6% на ТЕС і ВЕС.</w:t>
             </w:r>
           </w:p>
         </w:tc>
@@ -1748,7 +1748,7 @@
                 <w:sz w:val="24"/>
                 <w:szCs w:val="24"/>
               </w:rPr>
-              <w:t xml:space="preserve">Головна галузь - видобуток нафти і газу, 90% йде на експорт. Електроенергії 149,5 млрд кВт·год, майже 96% дають ГЕС.</w:t>
+              <w:t xml:space="preserve">Головна галузь - видобуток нафти і газу, 90% йде на експорт. Електроенергії 149,5 млрд кВт*год, майже 96% дають ГЕС.</w:t>
             </w:r>
           </w:p>
         </w:tc>

</xml_diff>

<commit_message>
Use Cyrillic company names and plain units in practical work #1
Co-Authored-By: Claude Opus 5.5 <noreply@anthropic.com>
Claude-Session: https://claude.ai/code/session_011dYD84B4oEmkuGGVGNerEV
</commit_message>
<xml_diff>
--- a/practical-1/Практична_робота_1.docx
+++ b/practical-1/Практична_робота_1.docx
@@ -2315,7 +2315,7 @@
                 <w:sz w:val="24"/>
                 <w:szCs w:val="24"/>
               </w:rPr>
-              <w:t xml:space="preserve">Nestlé (Вевей) - харчова</w:t>
+              <w:t xml:space="preserve">Нестле (Вевей) - харчова</w:t>
             </w:r>
           </w:p>
         </w:tc>
@@ -2379,7 +2379,7 @@
                 <w:sz w:val="24"/>
                 <w:szCs w:val="24"/>
               </w:rPr>
-              <w:t xml:space="preserve">Equinor (Ставангер) - нафта і газ</w:t>
+              <w:t xml:space="preserve">Еквінор (Ставангер) - нафта і газ</w:t>
             </w:r>
           </w:p>
         </w:tc>
@@ -2449,7 +2449,7 @@
                 <w:sz w:val="24"/>
                 <w:szCs w:val="24"/>
               </w:rPr>
-              <w:t xml:space="preserve">Novartis (Базель) - ліки</w:t>
+              <w:t xml:space="preserve">Новартіс (Базель) - ліки</w:t>
             </w:r>
           </w:p>
         </w:tc>
@@ -2513,7 +2513,7 @@
                 <w:sz w:val="24"/>
                 <w:szCs w:val="24"/>
               </w:rPr>
-              <w:t xml:space="preserve">Norsk Hydro (Осло) - алюміній</w:t>
+              <w:t xml:space="preserve">Норск Гідро (Осло) - алюміній</w:t>
             </w:r>
           </w:p>
         </w:tc>
@@ -2583,7 +2583,7 @@
                 <w:sz w:val="24"/>
                 <w:szCs w:val="24"/>
               </w:rPr>
-              <w:t xml:space="preserve">Roche (Базель) - ліки</w:t>
+              <w:t xml:space="preserve">Рош (Базель) - ліки</w:t>
             </w:r>
           </w:p>
         </w:tc>
@@ -2647,7 +2647,7 @@
                 <w:sz w:val="24"/>
                 <w:szCs w:val="24"/>
               </w:rPr>
-              <w:t xml:space="preserve">Yara (Осло) - добрива</w:t>
+              <w:t xml:space="preserve">Яра (Осло) - добрива</w:t>
             </w:r>
           </w:p>
         </w:tc>
@@ -2717,7 +2717,7 @@
                 <w:sz w:val="24"/>
                 <w:szCs w:val="24"/>
               </w:rPr>
-              <w:t xml:space="preserve">ABB (Цюрих) - електротехніка</w:t>
+              <w:t xml:space="preserve">АББ (Цюрих) - електротехніка</w:t>
             </w:r>
           </w:p>
         </w:tc>
@@ -2781,7 +2781,7 @@
                 <w:sz w:val="24"/>
                 <w:szCs w:val="24"/>
               </w:rPr>
-              <w:t xml:space="preserve">Aker (Осло) - обладнання для нафтовидобутку</w:t>
+              <w:t xml:space="preserve">Акер (Осло) - обладнання для нафтовидобутку</w:t>
             </w:r>
           </w:p>
         </w:tc>
@@ -2851,7 +2851,7 @@
                 <w:sz w:val="24"/>
                 <w:szCs w:val="24"/>
               </w:rPr>
-              <w:t xml:space="preserve">Swatch Group (Біль) - годинники</w:t>
+              <w:t xml:space="preserve">Своч Груп (Біль) - годинники</w:t>
             </w:r>
           </w:p>
         </w:tc>
@@ -2915,7 +2915,7 @@
                 <w:sz w:val="24"/>
                 <w:szCs w:val="24"/>
               </w:rPr>
-              <w:t xml:space="preserve">Kongsberg (Конгсберг) - техніка для кораблів</w:t>
+              <w:t xml:space="preserve">Конгсберг (Конгсберг) - техніка для кораблів</w:t>
             </w:r>
           </w:p>
         </w:tc>
@@ -2985,7 +2985,7 @@
                 <w:sz w:val="24"/>
                 <w:szCs w:val="24"/>
               </w:rPr>
-              <w:t xml:space="preserve">Glencore (Бар) - сировина</w:t>
+              <w:t xml:space="preserve">Гленкор (Бар) - сировина</w:t>
             </w:r>
           </w:p>
         </w:tc>
@@ -3049,7 +3049,7 @@
                 <w:sz w:val="24"/>
                 <w:szCs w:val="24"/>
               </w:rPr>
-              <w:t xml:space="preserve">Mowi (Берген) - лосось</w:t>
+              <w:t xml:space="preserve">Мові (Берген) - лосось</w:t>
             </w:r>
           </w:p>
         </w:tc>
@@ -3119,7 +3119,7 @@
                 <w:sz w:val="24"/>
                 <w:szCs w:val="24"/>
               </w:rPr>
-              <w:t xml:space="preserve">Holcim (Цуг) - цемент</w:t>
+              <w:t xml:space="preserve">Холсім (Цуг) - цемент</w:t>
             </w:r>
           </w:p>
         </w:tc>
@@ -3183,7 +3183,7 @@
                 <w:sz w:val="24"/>
                 <w:szCs w:val="24"/>
               </w:rPr>
-              <w:t xml:space="preserve">Orkla (Осло) - харчові продукти</w:t>
+              <w:t xml:space="preserve">Оркла (Осло) - харчові продукти</w:t>
             </w:r>
           </w:p>
         </w:tc>
@@ -3544,7 +3544,7 @@
           <w:sz w:val="28"/>
           <w:szCs w:val="28"/>
         </w:rPr>
-        <w:t xml:space="preserve">У Норвегії в містах живе приблизно 84% населення. Густота населення дуже мала, близько 15 осіб на км². Люди живуть переважно на півдні і вздовж узбережжя. Найбільше місто - Осло (близько 700 тис. жителів), потім Берген, Тронгейм, Ставангер. На півночі міста маленькі, це в основному порти і рибальські селища.</w:t>
+        <w:t xml:space="preserve">У Норвегії в містах живе приблизно 84% населення. Густота населення дуже мала, близько 15 осіб на кв. км. Люди живуть переважно на півдні і вздовж узбережжя. Найбільше місто - Осло (близько 700 тис. жителів), потім Берген, Тронгейм, Ставангер. На півночі міста маленькі, це в основному порти і рибальські селища.</w:t>
       </w:r>
     </w:p>
     <w:sectPr>

</xml_diff>